<commit_message>
refactor: change application tracking id formula, add create staffs command, and test in departmants
</commit_message>
<xml_diff>
--- a/letter.docx
+++ b/letter.docx
@@ -76,7 +76,9 @@
                               </w:rPr>
                             </w:pPr>
                             <w:r>
-                              <w:rPr/>
+                              <w:rPr>
+                                <w:color w:val="000000"/>
+                              </w:rPr>
                               <w:drawing>
                                 <wp:inline distT="0" distB="0" distL="0" distR="0">
                                   <wp:extent cx="914400" cy="914400"/>
@@ -132,6 +134,7 @@
                               <w:rPr>
                                 <w:b/>
                                 <w:bCs/>
+                                <w:color w:val="000000"/>
                               </w:rPr>
                               <w:t>IRAN UNIVERSITY OF SCIENCE &amp; TECHNOLOGY</w:t>
                             </w:r>
@@ -142,10 +145,14 @@
                               <w:shd w:val="clear" w:color="auto" w:fill="FFFFFF" w:themeFill="background1"/>
                               <w:spacing w:before="0" w:after="0"/>
                               <w:jc w:val="center"/>
-                              <w:rPr/>
+                              <w:rPr>
+                                <w:color w:val="000000"/>
+                              </w:rPr>
                             </w:pPr>
                             <w:r>
-                              <w:rPr/>
+                              <w:rPr>
+                                <w:color w:val="000000"/>
+                              </w:rPr>
                             </w:r>
                           </w:p>
                         </w:txbxContent>
@@ -164,7 +171,7 @@
             <w:pict>
               <v:rect id="shape_0" ID="Text Box 2" path="m0,0l-2147483645,0l-2147483645,-2147483646l0,-2147483646xe" stroked="f" o:allowincell="f" style="position:absolute;margin-left:-14.5pt;margin-top:-48.75pt;width:465.7pt;height:126.7pt;mso-wrap-style:square;v-text-anchor:top;mso-position-horizontal:right;mso-position-horizontal-relative:margin" wp14:anchorId="54AE4030">
                 <v:fill o:detectmouseclick="t" on="false"/>
-                <v:stroke color="#3465a4" weight="12600" joinstyle="miter" endcap="flat"/>
+                <v:stroke color="#3465a4" weight="12600" joinstyle="round" endcap="flat"/>
                 <v:textbox>
                   <w:txbxContent>
                     <w:p>
@@ -185,7 +192,9 @@
                         </w:rPr>
                       </w:pPr>
                       <w:r>
-                        <w:rPr/>
+                        <w:rPr>
+                          <w:color w:val="000000"/>
+                        </w:rPr>
                         <w:drawing>
                           <wp:inline distT="0" distB="0" distL="0" distR="0">
                             <wp:extent cx="914400" cy="914400"/>
@@ -241,6 +250,7 @@
                         <w:rPr>
                           <w:b/>
                           <w:bCs/>
+                          <w:color w:val="000000"/>
                         </w:rPr>
                         <w:t>IRAN UNIVERSITY OF SCIENCE &amp; TECHNOLOGY</w:t>
                       </w:r>
@@ -251,10 +261,14 @@
                         <w:shd w:val="clear" w:color="auto" w:fill="FFFFFF" w:themeFill="background1"/>
                         <w:spacing w:before="0" w:after="0"/>
                         <w:jc w:val="center"/>
-                        <w:rPr/>
+                        <w:rPr>
+                          <w:color w:val="000000"/>
+                        </w:rPr>
                       </w:pPr>
                       <w:r>
-                        <w:rPr/>
+                        <w:rPr>
+                          <w:color w:val="000000"/>
+                        </w:rPr>
                       </w:r>
                     </w:p>
                   </w:txbxContent>
@@ -301,7 +315,7 @@
         <mc:AlternateContent>
           <mc:Choice Requires="wps">
             <w:drawing>
-              <wp:anchor behindDoc="0" distT="19050" distB="19050" distL="19050" distR="28575" simplePos="0" locked="0" layoutInCell="0" allowOverlap="1" relativeHeight="4" wp14:anchorId="4D6510B7">
+              <wp:anchor behindDoc="0" distT="14605" distB="14605" distL="635" distR="0" simplePos="0" locked="0" layoutInCell="0" allowOverlap="1" relativeHeight="4" wp14:anchorId="4D6510B7">
                 <wp:simplePos x="0" y="0"/>
                 <wp:positionH relativeFrom="margin">
                   <wp:posOffset>0</wp:posOffset>
@@ -1098,10 +1112,14 @@
                             <w:pPr>
                               <w:pStyle w:val="FrameContents"/>
                               <w:spacing w:before="0" w:after="160"/>
-                              <w:rPr/>
+                              <w:rPr>
+                                <w:color w:val="000000"/>
+                              </w:rPr>
                             </w:pPr>
                             <w:r>
-                              <w:rPr/>
+                              <w:rPr>
+                                <w:color w:val="000000"/>
+                              </w:rPr>
                               <w:drawing>
                                 <wp:inline distT="0" distB="0" distL="0" distR="0">
                                   <wp:extent cx="1311910" cy="772160"/>
@@ -1164,10 +1182,14 @@
                       <w:pPr>
                         <w:pStyle w:val="FrameContents"/>
                         <w:spacing w:before="0" w:after="160"/>
-                        <w:rPr/>
+                        <w:rPr>
+                          <w:color w:val="000000"/>
+                        </w:rPr>
                       </w:pPr>
                       <w:r>
-                        <w:rPr/>
+                        <w:rPr>
+                          <w:color w:val="000000"/>
+                        </w:rPr>
                         <w:drawing>
                           <wp:inline distT="0" distB="0" distL="0" distR="0">
                             <wp:extent cx="1311910" cy="772160"/>
@@ -1512,38 +1534,7 @@
         </w:rPr>
       </w:pPr>
       <w:r>
-        <w:rPr>
-          <w:rFonts w:cs="Times New Roman" w:cstheme="majorBidi" w:ascii="Times New Roman" w:hAnsi="Times New Roman"/>
-          <w:sz w:val="2"/>
-          <w:szCs w:val="2"/>
-          <w:lang w:bidi="fa-IR"/>
-        </w:rPr>
-      </w:r>
-    </w:p>
-    <w:p>
-      <w:pPr>
-        <w:pStyle w:val="Normal"/>
-        <w:spacing w:before="0" w:after="0"/>
-        <w:rPr>
-          <w:rFonts w:ascii="Times New Roman" w:hAnsi="Times New Roman" w:cs="Times New Roman" w:asciiTheme="majorBidi" w:cstheme="majorBidi" w:hAnsiTheme="majorBidi"/>
-          <w:i/>
-          <w:i/>
-          <w:iCs/>
-          <w:sz w:val="20"/>
-          <w:szCs w:val="20"/>
-          <w:lang w:bidi="fa-IR"/>
-        </w:rPr>
-      </w:pPr>
-      <w:r>
-        <w:rPr>
-          <w:rFonts w:cs="Times New Roman" w:ascii="Times New Roman" w:hAnsi="Times New Roman" w:asciiTheme="majorBidi" w:cstheme="majorBidi" w:hAnsiTheme="majorBidi"/>
-          <w:i/>
-          <w:iCs/>
-          <w:sz w:val="20"/>
-          <w:szCs w:val="20"/>
-          <w:lang w:bidi="fa-IR"/>
-        </w:rPr>
-        <w:t>Saorg code: It is not available.</w:t>
+        <w:rPr/>
       </w:r>
     </w:p>
     <w:p>
@@ -1557,7 +1548,7 @@
         <mc:AlternateContent>
           <mc:Choice Requires="wps">
             <w:drawing>
-              <wp:anchor behindDoc="0" distT="0" distB="0" distL="0" distR="2540" simplePos="0" locked="0" layoutInCell="0" allowOverlap="1" relativeHeight="5" wp14:anchorId="438D41DE">
+              <wp:anchor behindDoc="0" distT="0" distB="0" distL="635" distR="0" simplePos="0" locked="0" layoutInCell="0" allowOverlap="1" relativeHeight="5" wp14:anchorId="438D41DE">
                 <wp:simplePos x="0" y="0"/>
                 <wp:positionH relativeFrom="margin">
                   <wp:align>right</wp:align>
@@ -1609,6 +1600,7 @@
                             <w:r>
                               <w:rPr>
                                 <w:rFonts w:cs="Times New Roman" w:ascii="Times New Roman" w:hAnsi="Times New Roman" w:asciiTheme="majorBidi" w:cstheme="majorBidi" w:hAnsiTheme="majorBidi"/>
+                                <w:color w:val="000000"/>
                               </w:rPr>
                               <w:t>Iran University of Science &amp; Technology,</w:t>
                             </w:r>
@@ -1626,6 +1618,7 @@
                             <w:r>
                               <w:rPr>
                                 <w:rFonts w:cs="Times New Roman" w:ascii="Times New Roman" w:hAnsi="Times New Roman" w:asciiTheme="majorBidi" w:cstheme="majorBidi" w:hAnsiTheme="majorBidi"/>
+                                <w:color w:val="000000"/>
                               </w:rPr>
                               <w:t>Narmak,Tehran 1684613114, Iran.</w:t>
                             </w:r>
@@ -1643,12 +1636,14 @@
                             <w:r>
                               <w:rPr>
                                 <w:rFonts w:cs="Times New Roman" w:ascii="Times New Roman" w:hAnsi="Times New Roman" w:asciiTheme="majorBidi" w:cstheme="majorBidi" w:hAnsiTheme="majorBidi"/>
+                                <w:color w:val="000000"/>
                               </w:rPr>
                               <w:t xml:space="preserve">Tel: </w:t>
                             </w:r>
                             <w:r>
                               <w:rPr>
                                 <w:rFonts w:eastAsia="Times New Roman" w:cs="Times New Roman" w:ascii="Times New Roman" w:hAnsi="Times New Roman" w:asciiTheme="majorBidi" w:cstheme="majorBidi" w:hAnsiTheme="majorBidi"/>
+                                <w:color w:val="000000"/>
                               </w:rPr>
                               <w:t>+98 21 77240251</w:t>
                             </w:r>
@@ -1666,6 +1661,7 @@
                             <w:r>
                               <w:rPr>
                                 <w:rFonts w:eastAsia="Times New Roman" w:cs="Times New Roman" w:ascii="Times New Roman" w:hAnsi="Times New Roman" w:asciiTheme="majorBidi" w:cstheme="majorBidi" w:hAnsiTheme="majorBidi"/>
+                                <w:color w:val="000000"/>
                               </w:rPr>
                               <w:t>Fax: +98 21 73021454</w:t>
                             </w:r>
@@ -1683,6 +1679,7 @@
                             <w:r>
                               <w:rPr>
                                 <w:rFonts w:eastAsia="Times New Roman" w:cs="Times New Roman" w:ascii="Times New Roman" w:hAnsi="Times New Roman" w:asciiTheme="majorBidi" w:cstheme="majorBidi" w:hAnsiTheme="majorBidi"/>
+                                <w:color w:val="000000"/>
                               </w:rPr>
                               <w:t>* Details are provided in: admission.iust.ac.ir</w:t>
                             </w:r>
@@ -1701,7 +1698,7 @@
           </mc:Choice>
           <mc:Fallback>
             <w:pict>
-              <v:rect id="shape_0" ID="Text Box 6" path="m0,0l-2147483645,0l-2147483645,-2147483646l0,-2147483646xe" fillcolor="white" stroked="f" o:allowincell="f" style="position:absolute;margin-left:-16.75pt;margin-top:7.35pt;width:467.7pt;height:80.95pt;mso-wrap-style:square;v-text-anchor:top;mso-position-horizontal:right;mso-position-horizontal-relative:margin" wp14:anchorId="438D41DE">
+              <v:rect id="shape_0" ID="Text Box 6" path="m0,0l-2147483645,0l-2147483645,-2147483646l0,-2147483646xe" fillcolor="white" stroked="f" o:allowincell="f" style="position:absolute;margin-left:-16.5pt;margin-top:7.35pt;width:467.7pt;height:80.95pt;mso-wrap-style:square;v-text-anchor:top;mso-position-horizontal:right;mso-position-horizontal-relative:margin" wp14:anchorId="438D41DE">
                 <v:fill o:detectmouseclick="t" type="solid" color2="black"/>
                 <v:stroke color="#3465a4" weight="6480" joinstyle="round" endcap="flat"/>
                 <v:textbox>
@@ -1719,6 +1716,7 @@
                       <w:r>
                         <w:rPr>
                           <w:rFonts w:cs="Times New Roman" w:ascii="Times New Roman" w:hAnsi="Times New Roman" w:asciiTheme="majorBidi" w:cstheme="majorBidi" w:hAnsiTheme="majorBidi"/>
+                          <w:color w:val="000000"/>
                         </w:rPr>
                         <w:t>Iran University of Science &amp; Technology,</w:t>
                       </w:r>
@@ -1736,6 +1734,7 @@
                       <w:r>
                         <w:rPr>
                           <w:rFonts w:cs="Times New Roman" w:ascii="Times New Roman" w:hAnsi="Times New Roman" w:asciiTheme="majorBidi" w:cstheme="majorBidi" w:hAnsiTheme="majorBidi"/>
+                          <w:color w:val="000000"/>
                         </w:rPr>
                         <w:t>Narmak,Tehran 1684613114, Iran.</w:t>
                       </w:r>
@@ -1753,12 +1752,14 @@
                       <w:r>
                         <w:rPr>
                           <w:rFonts w:cs="Times New Roman" w:ascii="Times New Roman" w:hAnsi="Times New Roman" w:asciiTheme="majorBidi" w:cstheme="majorBidi" w:hAnsiTheme="majorBidi"/>
+                          <w:color w:val="000000"/>
                         </w:rPr>
                         <w:t xml:space="preserve">Tel: </w:t>
                       </w:r>
                       <w:r>
                         <w:rPr>
                           <w:rFonts w:eastAsia="Times New Roman" w:cs="Times New Roman" w:ascii="Times New Roman" w:hAnsi="Times New Roman" w:asciiTheme="majorBidi" w:cstheme="majorBidi" w:hAnsiTheme="majorBidi"/>
+                          <w:color w:val="000000"/>
                         </w:rPr>
                         <w:t>+98 21 77240251</w:t>
                       </w:r>
@@ -1776,6 +1777,7 @@
                       <w:r>
                         <w:rPr>
                           <w:rFonts w:eastAsia="Times New Roman" w:cs="Times New Roman" w:ascii="Times New Roman" w:hAnsi="Times New Roman" w:asciiTheme="majorBidi" w:cstheme="majorBidi" w:hAnsiTheme="majorBidi"/>
+                          <w:color w:val="000000"/>
                         </w:rPr>
                         <w:t>Fax: +98 21 73021454</w:t>
                       </w:r>
@@ -1793,6 +1795,7 @@
                       <w:r>
                         <w:rPr>
                           <w:rFonts w:eastAsia="Times New Roman" w:cs="Times New Roman" w:ascii="Times New Roman" w:hAnsi="Times New Roman" w:asciiTheme="majorBidi" w:cstheme="majorBidi" w:hAnsiTheme="majorBidi"/>
+                          <w:color w:val="000000"/>
                         </w:rPr>
                         <w:t>* Details are provided in: admission.iust.ac.ir</w:t>
                       </w:r>
@@ -2220,6 +2223,7 @@
     <w:rsid w:val="00b05d2f"/>
     <w:pPr>
       <w:widowControl/>
+      <w:suppressAutoHyphens w:val="true"/>
       <w:bidi w:val="0"/>
       <w:spacing w:lineRule="auto" w:line="259" w:before="0" w:after="160"/>
       <w:jc w:val="left"/>

</xml_diff>

<commit_message>
refactor: update letter file
</commit_message>
<xml_diff>
--- a/letter.docx
+++ b/letter.docx
@@ -76,9 +76,7 @@
                               </w:rPr>
                             </w:pPr>
                             <w:r>
-                              <w:rPr>
-                                <w:color w:val="000000"/>
-                              </w:rPr>
+                              <w:rPr/>
                               <w:drawing>
                                 <wp:inline distT="0" distB="0" distL="0" distR="0">
                                   <wp:extent cx="914400" cy="914400"/>
@@ -150,9 +148,7 @@
                               </w:rPr>
                             </w:pPr>
                             <w:r>
-                              <w:rPr>
-                                <w:color w:val="000000"/>
-                              </w:rPr>
+                              <w:rPr/>
                             </w:r>
                           </w:p>
                         </w:txbxContent>
@@ -192,9 +188,7 @@
                         </w:rPr>
                       </w:pPr>
                       <w:r>
-                        <w:rPr>
-                          <w:color w:val="000000"/>
-                        </w:rPr>
+                        <w:rPr/>
                         <w:drawing>
                           <wp:inline distT="0" distB="0" distL="0" distR="0">
                             <wp:extent cx="914400" cy="914400"/>
@@ -266,9 +260,7 @@
                         </w:rPr>
                       </w:pPr>
                       <w:r>
-                        <w:rPr>
-                          <w:color w:val="000000"/>
-                        </w:rPr>
+                        <w:rPr/>
                       </w:r>
                     </w:p>
                   </w:txbxContent>
@@ -671,7 +663,27 @@
           <w:sz w:val="24"/>
           <w:szCs w:val="24"/>
         </w:rPr>
-        <w:t>Program: &lt;&lt;field_of_study&gt;&gt;</w:t>
+        <w:t xml:space="preserve">Program: </w:t>
+      </w:r>
+      <w:r>
+        <w:rPr>
+          <w:rFonts w:cs="Times New Roman" w:ascii="Times New Roman" w:hAnsi="Times New Roman" w:asciiTheme="majorBidi" w:cstheme="majorBidi" w:hAnsiTheme="majorBidi"/>
+          <w:b/>
+          <w:bCs/>
+          <w:sz w:val="26"/>
+          <w:szCs w:val="26"/>
+        </w:rPr>
+        <w:t xml:space="preserve">&lt;&lt;faculty&gt;&gt; - </w:t>
+      </w:r>
+      <w:r>
+        <w:rPr>
+          <w:rFonts w:cs="Times New Roman" w:ascii="Times New Roman" w:hAnsi="Times New Roman" w:asciiTheme="majorBidi" w:cstheme="majorBidi" w:hAnsiTheme="majorBidi"/>
+          <w:b/>
+          <w:bCs/>
+          <w:sz w:val="24"/>
+          <w:szCs w:val="24"/>
+        </w:rPr>
+        <w:t>&lt;&lt;field_of_study&gt;&gt;</w:t>
       </w:r>
     </w:p>
     <w:p>
@@ -1534,7 +1546,37 @@
         </w:rPr>
       </w:pPr>
       <w:r>
-        <w:rPr/>
+        <w:rPr>
+          <w:rFonts w:cs="Times New Roman" w:cstheme="majorBidi" w:ascii="Times New Roman" w:hAnsi="Times New Roman"/>
+          <w:sz w:val="2"/>
+          <w:szCs w:val="2"/>
+          <w:lang w:bidi="fa-IR"/>
+        </w:rPr>
+      </w:r>
+    </w:p>
+    <w:p>
+      <w:pPr>
+        <w:pStyle w:val="Normal"/>
+        <w:spacing w:before="0" w:after="0"/>
+        <w:rPr>
+          <w:rFonts w:ascii="Times New Roman" w:hAnsi="Times New Roman" w:cs="Times New Roman" w:asciiTheme="majorBidi" w:cstheme="majorBidi" w:hAnsiTheme="majorBidi"/>
+          <w:i/>
+          <w:i/>
+          <w:iCs/>
+          <w:sz w:val="20"/>
+          <w:szCs w:val="20"/>
+          <w:lang w:bidi="fa-IR"/>
+        </w:rPr>
+      </w:pPr>
+      <w:r>
+        <w:rPr>
+          <w:rFonts w:cs="Times New Roman" w:cstheme="majorBidi" w:ascii="Times New Roman" w:hAnsi="Times New Roman"/>
+          <w:i/>
+          <w:iCs/>
+          <w:sz w:val="20"/>
+          <w:szCs w:val="20"/>
+          <w:lang w:bidi="fa-IR"/>
+        </w:rPr>
       </w:r>
     </w:p>
     <w:p>

</xml_diff>

<commit_message>
refactor: remove admin panel
</commit_message>
<xml_diff>
--- a/letter.docx
+++ b/letter.docx
@@ -664,16 +664,6 @@
           <w:szCs w:val="24"/>
         </w:rPr>
         <w:t xml:space="preserve">Program: </w:t>
-      </w:r>
-      <w:r>
-        <w:rPr>
-          <w:rFonts w:cs="Times New Roman" w:ascii="Times New Roman" w:hAnsi="Times New Roman" w:asciiTheme="majorBidi" w:cstheme="majorBidi" w:hAnsiTheme="majorBidi"/>
-          <w:b/>
-          <w:bCs/>
-          <w:sz w:val="26"/>
-          <w:szCs w:val="26"/>
-        </w:rPr>
-        <w:t xml:space="preserve">&lt;&lt;faculty&gt;&gt; - </w:t>
       </w:r>
       <w:r>
         <w:rPr>

</xml_diff>